<commit_message>
docs: justificar texto de requerimientos tecnicos
</commit_message>
<xml_diff>
--- a/Propuestas/Formalizacion/Requerimientos_Tecnicos_Occidente_v1.0.docx
+++ b/Propuestas/Formalizacion/Requerimientos_Tecnicos_Occidente_v1.0.docx
@@ -37,11 +37,17 @@
       </w:r>
     </w:p>
     <w:p>
+      <w:pPr>
+        <w:jc w:val="both"/>
+      </w:pPr>
       <w:r>
         <w:t>Solicitamos a Occidente habilitar los ambientes, servicios, accesos e información descritos en este documento para implementar el motor de análisis y su portal administrativo e integrarlos con Oracle APEX. IT y MACAO deberán confirmar las decisiones técnicas en la semana 1 y disponer del ambiente de pruebas al iniciar la semana 2.</w:t>
       </w:r>
     </w:p>
     <w:p>
+      <w:pPr>
+        <w:jc w:val="both"/>
+      </w:pPr>
       <w:r>
         <w:t>Este documento desarrolla los prerrequisitos de la propuesta v2.0. El banco mantiene los formularios, la bandeja de calidad, el repositorio documental y la integración con el sistema central. MACAO desarrolla las pantallas del portal administrativo, el motor y los endpoints de su componente.</w:t>
       </w:r>
@@ -410,11 +416,17 @@
       </w:tr>
     </w:tbl>
     <w:p>
+      <w:pPr>
+        <w:jc w:val="both"/>
+      </w:pPr>
       <w:r>
         <w:t/>
       </w:r>
     </w:p>
     <w:p>
+      <w:pPr>
+        <w:jc w:val="both"/>
+      </w:pPr>
       <w:r>
         <w:t>La capacidad es una referencia inicial, no una garantía de rendimiento. No incluye almacenamiento histórico de documentos ni capacidad de la base de datos. Se ajustará según expedientes por día, páginas, tamaños, concurrencia, retención y tiempo objetivo. El esquema base consume Gemini por API y no requiere GPU local.</w:t>
       </w:r>
@@ -437,6 +449,9 @@
       </w:r>
     </w:p>
     <w:p>
+      <w:pPr>
+        <w:jc w:val="both"/>
+      </w:pPr>
       <w:r>
         <w:t>Occidente proporcionará un servicio de base de datos y un esquema dedicado, o servicios equivalentes acordados, para reglas y versiones, permisos, trabajos, resultados y auditoría. MACAO no requiere acceso de escritura al sistema central ni privilegios de administrador de la base.</w:t>
       </w:r>
@@ -743,6 +758,9 @@
       </w:tr>
     </w:tbl>
     <w:p>
+      <w:pPr>
+        <w:jc w:val="both"/>
+      </w:pPr>
       <w:r>
         <w:t/>
       </w:r>
@@ -800,11 +818,17 @@
       </w:r>
     </w:p>
     <w:p>
+      <w:pPr>
+        <w:jc w:val="both"/>
+      </w:pPr>
       <w:r>
         <w:t>IT y AFP entregarán volumen promedio y pico de expedientes, documentos y páginas por expediente, tamaño medio y máximo, usuarios concurrentes, crecimiento y retención. El almacenamiento documental se estimará con volumen diario por tamaño medio por días de retención, agregando versiones, respaldos y margen operativo.</w:t>
       </w:r>
     </w:p>
     <w:p>
+      <w:pPr>
+        <w:jc w:val="both"/>
+      </w:pPr>
       <w:r>
         <w:t>Definir limpieza de temporales, conservación de resultados y evidencia, y eliminación autorizada. La persistencia del motor no exige duplicar de forma permanente todo el expediente custodiado en APEX.</w:t>
       </w:r>
@@ -827,6 +851,9 @@
       </w:r>
     </w:p>
     <w:p>
+      <w:pPr>
+        <w:jc w:val="both"/>
+      </w:pPr>
       <w:r>
         <w:t>Aprobar una matriz de origen, destino, puerto y propósito por ambiente. Los nombres DNS, direcciones y certificados definitivos se registrarán en el acta técnica; los siguientes flujos son los requeridos para el diseño base.</w:t>
       </w:r>
@@ -1295,6 +1322,9 @@
       </w:tr>
     </w:tbl>
     <w:p>
+      <w:pPr>
+        <w:jc w:val="both"/>
+      </w:pPr>
       <w:r>
         <w:t/>
       </w:r>
@@ -1335,6 +1365,9 @@
       </w:r>
     </w:p>
     <w:p>
+      <w:pPr>
+        <w:jc w:val="both"/>
+      </w:pPr>
       <w:r>
         <w:t>MACAO implementará los controles de acceso de su aplicación y entregará las rutas y permisos requeridos. IT validará la configuración de red, certificados y controles institucionales antes del piloto.</w:t>
       </w:r>
@@ -1801,6 +1834,9 @@
       </w:tr>
     </w:tbl>
     <w:p>
+      <w:pPr>
+        <w:jc w:val="both"/>
+      </w:pPr>
       <w:r>
         <w:t/>
       </w:r>
@@ -1814,11 +1850,17 @@
       </w:r>
     </w:p>
     <w:p>
+      <w:pPr>
+        <w:jc w:val="both"/>
+      </w:pPr>
       <w:r>
         <w:t>AFP y sus responsables de negocio entregarán la matriz aprobada de documentos, reglas y resultados esperados, junto con muestras autorizadas que cubran expedientes completos, incompletos, inconsistentes, ilegibles y corregidos. Se incluirán pruebas de duplicados, documentos no accesibles y caída temporal del proveedor.</w:t>
       </w:r>
     </w:p>
     <w:p>
+      <w:pPr>
+        <w:jc w:val="both"/>
+      </w:pPr>
       <w:r>
         <w:t>MACAO documentará el contrato y desarrollará el extremo del motor; IT desarrollará y verificará el extremo APEX. El primer intercambio se probará en semana 2 y el recorrido integrado deberá estar disponible para el piloto de semana 6.</w:t>
       </w:r>
@@ -1841,6 +1883,9 @@
       </w:r>
     </w:p>
     <w:p>
+      <w:pPr>
+        <w:jc w:val="both"/>
+      </w:pPr>
       <w:r>
         <w:t>El modelo requerido es Gemini 3.5 Flash-Lite, con identificador gemini-3.5-flash-lite. Occidente deberá proporcionar acceso por API al modelo en el servicio y proyecto que autorice. Una suscripción de chat no sustituye la habilitación de la API.</w:t>
       </w:r>
@@ -2147,6 +2192,9 @@
       </w:tr>
     </w:tbl>
     <w:p>
+      <w:pPr>
+        <w:jc w:val="both"/>
+      </w:pPr>
       <w:r>
         <w:t/>
       </w:r>
@@ -2160,11 +2208,17 @@
       </w:r>
     </w:p>
     <w:p>
+      <w:pPr>
+        <w:jc w:val="both"/>
+      </w:pPr>
       <w:r>
         <w:t>Aunque el motor y el portal se instalen en un servidor local, el contenido que se envía a Gemini será procesado en el servicio externo autorizado. IT debe confirmar que la política del banco permite este flujo antes de utilizar expedientes reales.</w:t>
       </w:r>
     </w:p>
     <w:p>
+      <w:pPr>
+        <w:jc w:val="both"/>
+      </w:pPr>
       <w:r>
         <w:t>MACAO aplicará límites de concurrencia y reintentos, registrará errores de cuota o disponibilidad y conservará la relación entre resultado, expediente y versión. Los documentos se tratarán como datos no confiables; su contenido no deberá habilitar acciones ni modificar reglas. Los casos inciertos o fallidos quedarán sujetos a revisión humana.</w:t>
       </w:r>
@@ -2178,11 +2232,17 @@
       </w:r>
     </w:p>
     <w:p>
+      <w:pPr>
+        <w:jc w:val="both"/>
+      </w:pPr>
       <w:r>
         <w:t>El banco será responsable de monitorear los avisos de deprecación o retiro del modelo por Google y mantener un modelo vigente, habilitando y coordinando su sustitución antes de la fecha de retiro. El reemplazo deberá validarse con el motor antes de producción. Las adaptaciones de software o pruebas adicionales que requieran intervención de MACAO se evaluarán y acordarán por escrito bajo soporte o control de cambios.</w:t>
       </w:r>
     </w:p>
     <w:p>
+      <w:pPr>
+        <w:jc w:val="both"/>
+      </w:pPr>
       <w:r>
         <w:t>El responsable designado por IT documentará la versión utilizada y coordinará pruebas comparativas con el conjunto de referencia aprobado antes de cambiar el modelo. No se realizará una sustitución automática sin validación.</w:t>
       </w:r>
@@ -2196,6 +2256,9 @@
       </w:r>
     </w:p>
     <w:p>
+      <w:pPr>
+        <w:jc w:val="both"/>
+      </w:pPr>
       <w:r>
         <w:t>Google AI for Developers, Gemini 3.5 Flash-Lite. Consultado el 14 de septiembre de 2026. https://ai.google.dev/gemini-api/docs/models/gemini-3.5-flash-lite</w:t>
       </w:r>
@@ -2218,6 +2281,9 @@
       </w:r>
     </w:p>
     <w:p>
+      <w:pPr>
+        <w:jc w:val="both"/>
+      </w:pPr>
       <w:r>
         <w:t>IT designará responsables de servidores, base de datos, repositorio, certificados, Gemini y soporte APEX. Antes de producción acordaremos retención de auditoría, pérdida máxima de datos aceptable y tiempo objetivo de recuperación. Estos objetivos requieren aprobación; no se presuponen niveles de servicio.</w:t>
       </w:r>
@@ -2613,6 +2679,9 @@
       </w:tr>
     </w:tbl>
     <w:p>
+      <w:pPr>
+        <w:jc w:val="both"/>
+      </w:pPr>
       <w:r>
         <w:t/>
       </w:r>
@@ -2626,11 +2695,17 @@
       </w:r>
     </w:p>
     <w:p>
+      <w:pPr>
+        <w:jc w:val="both"/>
+      </w:pPr>
       <w:r>
         <w:t>Se registrará evidencia de acceso al portal, intercambio APEX con la versión correcta, lectura documental, escritura autorizada en la base, llamada a Gemini, rechazo de accesos sin permiso y recuperación de un error. Para producción se añadirá la prueba de respaldo y restauración y la conformidad operativa de IT y AFP.</w:t>
       </w:r>
     </w:p>
     <w:p>
+      <w:pPr>
+        <w:jc w:val="both"/>
+      </w:pPr>
       <w:r>
         <w:t>La coordinación contempla seguimiento semanal, sesión técnica con IT de hasta 60 minutos y revisiones previstas en el plan. Las dependencias pendientes tendrán responsable y fecha; cualquier impacto en el piloto o las ocho semanas se documentará y acordará entre las partes.</w:t>
       </w:r>

</xml_diff>

<commit_message>
docs: incorporar diagrama de arquitectura de la solucion
</commit_message>
<xml_diff>
--- a/Propuestas/Formalizacion/Requerimientos_Tecnicos_Occidente_v1.0.docx
+++ b/Propuestas/Formalizacion/Requerimientos_Tecnicos_Occidente_v1.0.docx
@@ -2717,6 +2717,83 @@
         <w:t>Responsable AFP ____________________   Responsable MACAO ____________________</w:t>
       </w:r>
     </w:p>
+    <w:p>
+      <w:pPr>
+        <w:pStyle w:val="Heading1"/>
+        <w:pageBreakBefore/>
+      </w:pPr>
+      <w:r>
+        <w:t>7 Arquitectura de la solución</w:t>
+      </w:r>
+    </w:p>
+    <w:p>
+      <w:pPr>
+        <w:jc w:val="both"/>
+      </w:pPr>
+      <w:r>
+        <w:t>El siguiente diagrama presenta los componentes y sus conexiones lógicas. Los bloques con borde rojo son desarrollados por MACAO y se instalan en infraestructura del banco. Los ambientes de pruebas y producción mantienen la misma separación de responsabilidades.</w:t>
+      </w:r>
+    </w:p>
+    <w:p>
+      <w:r>
+        <w:drawing>
+          <wp:inline xmlns:a="http://schemas.openxmlformats.org/drawingml/2006/main" xmlns:pic="http://schemas.openxmlformats.org/drawingml/2006/picture">
+            <wp:extent cx="6309360" cy="5162374"/>
+            <wp:docPr id="9001" name="Arquitectura de la solución" descr="APEX intercambia solicitudes y resultados con el motor MACAO, que utiliza base de datos y documentos del banco y la API externa Gemini. El portal permite administrar reglas y permisos."/>
+            <wp:cNvGraphicFramePr>
+              <a:graphicFrameLocks noChangeAspect="1"/>
+            </wp:cNvGraphicFramePr>
+            <a:graphic>
+              <a:graphicData uri="http://schemas.openxmlformats.org/drawingml/2006/picture">
+                <pic:pic>
+                  <pic:nvPicPr>
+                    <pic:cNvPr id="0" name="arquitectura.png"/>
+                    <pic:cNvPicPr/>
+                  </pic:nvPicPr>
+                  <pic:blipFill>
+                    <a:blip r:embed="rIdArchitecture"/>
+                    <a:stretch>
+                      <a:fillRect/>
+                    </a:stretch>
+                  </pic:blipFill>
+                  <pic:spPr>
+                    <a:xfrm>
+                      <a:off x="0" y="0"/>
+                      <a:ext cx="6309360" cy="5162374"/>
+                    </a:xfrm>
+                    <a:prstGeom prst="rect"/>
+                  </pic:spPr>
+                </pic:pic>
+              </a:graphicData>
+            </a:graphic>
+          </wp:inline>
+        </w:drawing>
+      </w:r>
+    </w:p>
+    <w:p>
+      <w:pPr>
+        <w:pStyle w:val="Heading2"/>
+      </w:pPr>
+      <w:r>
+        <w:t>Flujos principales</w:t>
+      </w:r>
+    </w:p>
+    <w:p>
+      <w:pPr>
+        <w:jc w:val="both"/>
+      </w:pPr>
+      <w:r>
+        <w:t>1 y 2. APEX envía el expediente y obtiene estados y resultados mediante consulta o callback acordado. 3. El motor accede al repositorio mediante lectura autenticada. 4. El motor envía a Gemini únicamente el contenido autorizado y recibe la respuesta para completar el análisis.</w:t>
+      </w:r>
+    </w:p>
+    <w:p>
+      <w:pPr>
+        <w:jc w:val="both"/>
+      </w:pPr>
+      <w:r>
+        <w:t>La aprobación permanece en personal autorizado y el ingreso al sistema central se gestiona desde APEX. El diagrama no implica servidores adicionales: el portal, la API y los procesos del motor pueden compartir la VM prevista. Base de datos y repositorio corresponden a los servicios provistos por Occidente.</w:t>
+      </w:r>
+    </w:p>
     <w:sectPr>
       <w:headerReference w:type="even" r:id="rId8"/>
       <w:headerReference w:type="default" r:id="rId9"/>

</xml_diff>